<commit_message>
Rename submission file to team_Jarvis2.0.csv and update all project references
</commit_message>
<xml_diff>
--- a/redrob_project_scenario_report.docx
+++ b/redrob_project_scenario_report.docx
@@ -121,7 +121,7 @@
         <w:pStyle w:val="ListBullet"/>
       </w:pPr>
       <w:r>
-        <w:t>Strict CSV Schema Format: The final output must be exactly team_204.csv with columns: candidate_id, rank, score, reasoning.</w:t>
+        <w:t>Strict CSV Schema Format: The final output must be exactly team_Jarvis2.0.csv with columns: candidate_id, rank, score, reasoning.</w:t>
       </w:r>
     </w:p>
     <w:p>
@@ -922,7 +922,7 @@
         <w:rPr>
           <w:b/>
         </w:rPr>
-        <w:t>team_204.csv</w:t>
+        <w:t>team_Jarvis2.0.csv</w:t>
       </w:r>
       <w:r>
         <w:t>) has been rigorously audited and passes all checks:</w:t>
@@ -1247,7 +1247,7 @@
           </w:tcPr>
           <w:p>
             <w:r>
-              <w:t>The official validation script. Confirms that the final team_204.csv submission matches column headers, has exactly 100 rows, uses non-negative monotonic scores, and breaks ties alphabetically.</w:t>
+              <w:t>The official validation script. Confirms that the final team_Jarvis2.0.csv submission matches column headers, has exactly 100 rows, uses non-negative monotonic scores, and breaks ties alphabetically.</w:t>
             </w:r>
           </w:p>
         </w:tc>
@@ -1370,7 +1370,7 @@
           </w:tcPr>
           <w:p>
             <w:r>
-              <w:t>team_204.csv</w:t>
+              <w:t>team_Jarvis2.0.csv</w:t>
             </w:r>
           </w:p>
         </w:tc>
@@ -1527,7 +1527,7 @@
           </w:tcPr>
           <w:p>
             <w:r>
-              <w:t>Participant details, team definitions, reproduction commands, portal methodology summary, and AI usage declaration.</w:t>
+              <w:t>Stores team details, contact information, reproduction command, portal methodology description, and AI usage declaration.</w:t>
             </w:r>
           </w:p>
         </w:tc>
@@ -1567,6 +1567,88 @@
         </w:tc>
       </w:tr>
     </w:tbl>
+    <w:p>
+      <w:pPr>
+        <w:pStyle w:val="Heading1"/>
+        <w:spacing w:before="360" w:after="120"/>
+      </w:pPr>
+      <w:r>
+        <w:rPr>
+          <w:rFonts w:ascii="Georgia" w:hAnsi="Georgia"/>
+          <w:b/>
+          <w:color w:val="1F4E79"/>
+          <w:sz w:val="36"/>
+        </w:rPr>
+        <w:t>7. Potential Vulnerabilities &amp; Mitigation Strategies</w:t>
+      </w:r>
+    </w:p>
+    <w:p>
+      <w:r>
+        <w:t>We identify two core system vulnerabilities and outline their theoretical impact and corresponding engineering mitigations:</w:t>
+      </w:r>
+    </w:p>
+    <w:p>
+      <w:pPr>
+        <w:pStyle w:val="ListBullet"/>
+      </w:pPr>
+      <w:r>
+        <w:rPr>
+          <w:b/>
+        </w:rPr>
+        <w:t xml:space="preserve">Vulnerability 1 — BM25 Lexical Dominance (Semantic Richness vs. Exact Keyword Overlap): </w:t>
+      </w:r>
+      <w:r>
+        <w:rPr>
+          <w:b/>
+        </w:rPr>
+        <w:br/>
+        <w:t xml:space="preserve">• Theoretical Risk: </w:t>
+      </w:r>
+      <w:r>
+        <w:t>Feature importance analysis shows that lexical matching (bm25_norm) dominates GBDT decisions. If judges favor semantic richness (overall role matching) over exact keyword match, a candidate with deep AI knowledge but missing specific terms (e.g. Pinecone, Elasticsearch) might rank lower than someone with exact keyword overlap but less overall depth.</w:t>
+      </w:r>
+      <w:r>
+        <w:rPr>
+          <w:b/>
+        </w:rPr>
+        <w:br/>
+        <w:t xml:space="preserve">• Mitigation Strategy: </w:t>
+      </w:r>
+      <w:r>
+        <w:t>BM25 serves as a high-recall filter to ensure that candidates possess the exact infrastructure tools required by the JD. The L-12 Cross-Encoder then acts as a high-precision semantic reranker. The combination is explicitly designed to balance strict technical constraints with semantic understanding, ensuring that candidates who write generic profiles without concrete tool experience do not slip into the shortlist.</w:t>
+      </w:r>
+    </w:p>
+    <w:p>
+      <w:pPr>
+        <w:pStyle w:val="ListBullet"/>
+      </w:pPr>
+      <w:r>
+        <w:rPr>
+          <w:b/>
+        </w:rPr>
+        <w:t xml:space="preserve">Vulnerability 2 — Heuristic Target circularity (Optimizing Heuristics rather than Ground-Truth): </w:t>
+      </w:r>
+      <w:r>
+        <w:rPr>
+          <w:b/>
+        </w:rPr>
+        <w:br/>
+        <w:t xml:space="preserve">• Theoretical Risk: </w:t>
+      </w:r>
+      <w:r>
+        <w:t>Because there is no human-labeled training dataset, the GBDT ranker was trained on heuristic targets. It is effectively learning a GBDT-based approximation of our own multiplier equations rather than discovering net-new predictive signals directly from raw data.</w:t>
+      </w:r>
+      <w:r>
+        <w:rPr>
+          <w:b/>
+        </w:rPr>
+        <w:br/>
+        <w:t xml:space="preserve">• Mitigation Strategy: </w:t>
+      </w:r>
+      <w:r>
+        <w:t>This form of boot-strapped training (distant supervision) is the industry standard for cold-starting search systems when human labels are unavailable. To transition this ranker into a true machine-learning model, the production pipeline should log click-logs, recruiter saves, and interview bookings over time. This interaction data will form a true pairwise click-log training dataset, breaking the heuristic circularity loop.</w:t>
+      </w:r>
+    </w:p>
     <w:sectPr>
       <w:pgSz w:w="12240" w:h="15840"/>
       <w:pgMar w:top="1440" w:right="1440" w:bottom="1440" w:left="1440" w:header="720" w:footer="720" w:gutter="0"/>

</xml_diff>